<commit_message>
MGMT 405 problem sets: PS 1 hand edits, submission banner, staggered-table fade, midpoint plotting, elasticity intervals
- Adopt Nico's PS 1 and PS 1 Solutions edits; navy submission banner with
  the TA line on all five problem sets
- Supply/demand terminology: never "supply expands"; a shift OF the curve
  vs. a move ALONG it. Swept all ten documents
- PS 3 tables: change columns to the far right, full-cell vertical fade via
  a floating anchored shape (an inline drawing can never cover the cell)
- Marginal values plotted at interval midpoints, in the solutions and in
  the question text
- Elasticity keeps the initial-point base but now names its interval, in
  the notation, the formula and the 1(c) figure
- Pagination discipline: measure bottom clearance, not page count
- CLAUDE.md updated for all of the above

Co-Authored-By: Claude Opus 5 <noreply@anthropic.com>
</commit_message>
<xml_diff>
--- a/405 Problem Sets/Problem Set 1.docx
+++ b/405 Problem Sets/Problem Set 1.docx
@@ -5,6 +5,7 @@
     <w:p>
       <w:pPr>
         <w:spacing w:before="0" w:after="20"/>
+        <w:jc w:val="center"/>
       </w:pPr>
       <w:r>
         <w:rPr>
@@ -15,11 +16,14 @@
           <w:sz w:val="40"/>
           <w:u w:val="none"/>
         </w:rPr>
-        <w:t>MGMT 405 – Managerial Economics</w:t>
+        <w:t>Problem Set 1</w:t>
       </w:r>
     </w:p>
     <w:p>
       <w:pPr>
+        <w:tabs>
+          <w:tab w:pos="9360" w:val="right"/>
+        </w:tabs>
         <w:spacing w:before="0" w:after="180"/>
         <w:pBdr>
           <w:bottom w:val="single" w:sz="18" w:space="6" w:color="E09F3E"/>
@@ -34,7 +38,27 @@
           <w:sz w:val="26"/>
           <w:u w:val="none"/>
         </w:rPr>
-        <w:t>Problem Set 1</w:t>
+        <w:t>MGMT 405 – Managerial Economics</w:t>
+      </w:r>
+      <w:r>
+        <w:rPr>
+          <w:rFonts w:ascii="Calibri" w:hAnsi="Calibri" w:eastAsia="Calibri" w:cs="Calibri"/>
+          <w:b w:val="0"/>
+          <w:i w:val="0"/>
+          <w:u w:val="none"/>
+        </w:rPr>
+        <w:tab/>
+      </w:r>
+      <w:r>
+        <w:rPr>
+          <w:rFonts w:ascii="Calibri" w:hAnsi="Calibri" w:eastAsia="Calibri" w:cs="Calibri"/>
+          <w:b/>
+          <w:i w:val="0"/>
+          <w:color w:val="555B66"/>
+          <w:sz w:val="22"/>
+          <w:u w:val="none"/>
+        </w:rPr>
+        <w:t>Prof. Nico Voigtländer</w:t>
       </w:r>
     </w:p>
     <w:p>
@@ -50,18 +74,40 @@
           <w:sz w:val="21"/>
           <w:u w:val="none"/>
         </w:rPr>
-        <w:t>Covers Modules 1 and 2     ·     100 points     ·     Due date: see the Course Calendar on BruinLearn</w:t>
+        <w:t>Covers Modules 1 and 2</w:t>
+      </w:r>
+      <w:r>
+        <w:rPr>
+          <w:rFonts w:ascii="Calibri" w:hAnsi="Calibri" w:eastAsia="Calibri" w:cs="Calibri"/>
+          <w:b w:val="0"/>
+          <w:i/>
+          <w:color w:val="555B66"/>
+          <w:sz w:val="21"/>
+          <w:u w:val="none"/>
+        </w:rPr>
+        <w:t xml:space="preserve">     ·     </w:t>
+      </w:r>
+      <w:r>
+        <w:rPr>
+          <w:rFonts w:ascii="Calibri" w:hAnsi="Calibri" w:eastAsia="Calibri" w:cs="Calibri"/>
+          <w:b w:val="0"/>
+          <w:i/>
+          <w:color w:val="555B66"/>
+          <w:sz w:val="21"/>
+          <w:u w:val="none"/>
+        </w:rPr>
+        <w:t>100 points     ·     Due date: see the Course Calendar on the Class Website</w:t>
       </w:r>
     </w:p>
     <w:p>
       <w:pPr>
-        <w:spacing w:before="140" w:after="140"/>
+        <w:spacing w:before="100" w:after="0"/>
         <w:jc w:val="center"/>
       </w:pPr>
       <w:r>
         <w:drawing xmlns:a="http://schemas.openxmlformats.org/drawingml/2006/main">
           <wp:inline distT="0" distB="0" distL="0" distR="0">
-            <wp:extent cx="5943600" cy="1397127"/>
+            <wp:extent cx="5943600" cy="465430"/>
             <wp:effectExtent l="0" t="0" r="76200" b="76200"/>
             <wp:docPr id="501" name="Card 501"/>
             <a:graphic>
@@ -71,11 +117,122 @@
                   <wps:spPr bwMode="auto">
                     <a:xfrm>
                       <a:off x="0" y="0"/>
-                      <a:ext cx="5943600" cy="1397127"/>
+                      <a:ext cx="5943600" cy="465430"/>
                     </a:xfrm>
                     <a:prstGeom prst="roundRect">
                       <a:avLst>
-                        <a:gd name="adj" fmla="val 7199"/>
+                        <a:gd name="adj" fmla="val 18000"/>
+                      </a:avLst>
+                    </a:prstGeom>
+                    <a:solidFill>
+                      <a:srgbClr val="0B2B4E"/>
+                    </a:solidFill>
+                    <a:ln w="9525">
+                      <a:solidFill>
+                        <a:srgbClr val="0B2B4E"/>
+                      </a:solidFill>
+                    </a:ln>
+                    <a:effectLst>
+                      <a:outerShdw blurRad="63500" dist="27940" dir="5400000" rotWithShape="0">
+                        <a:srgbClr val="000000">
+                          <a:alpha val="30000"/>
+                        </a:srgbClr>
+                      </a:outerShdw>
+                    </a:effectLst>
+                  </wps:spPr>
+                  <wps:txbx>
+                    <w:txbxContent>
+                      <w:p>
+                        <w:pPr>
+                          <w:spacing w:before="0" w:after="0"/>
+                          <w:jc w:val="center"/>
+                        </w:pPr>
+                        <w:r>
+                          <w:rPr>
+                            <w:rFonts w:ascii="Calibri" w:hAnsi="Calibri" w:eastAsia="Calibri" w:cs="Calibri"/>
+                            <w:b w:val="0"/>
+                            <w:i w:val="0"/>
+                            <w:color w:val="FFFFFF"/>
+                            <w:sz w:val="20"/>
+                            <w:u w:val="none"/>
+                          </w:rPr>
+                          <w:t xml:space="preserve">Please upload </w:t>
+                        </w:r>
+                        <w:r>
+                          <w:rPr>
+                            <w:rFonts w:ascii="Calibri" w:hAnsi="Calibri" w:eastAsia="Calibri" w:cs="Calibri"/>
+                            <w:b w:val="0"/>
+                            <w:i w:val="0"/>
+                            <w:color w:val="FFFFFF"/>
+                            <w:sz w:val="20"/>
+                            <w:u w:val="single"/>
+                          </w:rPr>
+                          <w:t>one</w:t>
+                        </w:r>
+                        <w:r>
+                          <w:rPr>
+                            <w:rFonts w:ascii="Calibri" w:hAnsi="Calibri" w:eastAsia="Calibri" w:cs="Calibri"/>
+                            <w:b w:val="0"/>
+                            <w:i w:val="0"/>
+                            <w:color w:val="FFFFFF"/>
+                            <w:sz w:val="20"/>
+                            <w:u w:val="none"/>
+                          </w:rPr>
+                          <w:t xml:space="preserve"> solution per group on the course BruinLearn site or email the group solution to the TA.</w:t>
+                        </w:r>
+                      </w:p>
+                      <w:p>
+                        <w:pPr>
+                          <w:spacing w:before="0" w:after="0"/>
+                          <w:jc w:val="center"/>
+                        </w:pPr>
+                        <w:r>
+                          <w:rPr>
+                            <w:rFonts w:ascii="Calibri" w:hAnsi="Calibri" w:eastAsia="Calibri" w:cs="Calibri"/>
+                            <w:b/>
+                            <w:i w:val="0"/>
+                            <w:color w:val="FFFFFF"/>
+                            <w:sz w:val="20"/>
+                            <w:u w:val="none"/>
+                          </w:rPr>
+                          <w:t>Please address all questions about this Problem Set to the TA Rafael Macedo</w:t>
+                        </w:r>
+                      </w:p>
+                    </w:txbxContent>
+                  </wps:txbx>
+                  <wps:bodyPr rot="0" vert="horz" wrap="square" lIns="109728" tIns="54864" rIns="109728" bIns="54864" anchor="t" anchorCtr="0">
+                    <a:noAutofit/>
+                  </wps:bodyPr>
+                </wps:wsp>
+              </a:graphicData>
+            </a:graphic>
+          </wp:inline>
+        </w:drawing>
+      </w:r>
+    </w:p>
+    <w:p>
+      <w:pPr>
+        <w:spacing w:before="120" w:after="120"/>
+        <w:jc w:val="center"/>
+      </w:pPr>
+      <w:r>
+        <w:drawing xmlns:a="http://schemas.openxmlformats.org/drawingml/2006/main">
+          <wp:inline distT="0" distB="0" distL="0" distR="0">
+            <wp:extent cx="5943600" cy="1771650"/>
+            <wp:effectExtent l="0" t="0" r="76200" b="76200"/>
+            <wp:docPr id="502" name="Card 502"/>
+            <a:graphic>
+              <a:graphicData uri="http://schemas.microsoft.com/office/word/2010/wordprocessingShape">
+                <wps:wsp>
+                  <wps:cNvSpPr/>
+                  <wps:spPr bwMode="auto">
+                    <a:xfrm>
+                      <a:off x="0" y="0"/>
+                      <a:ext cx="5943600" cy="1771650"/>
+                    </a:xfrm>
+                    <a:prstGeom prst="roundRect">
+                      <a:avLst>
+                        <a:gd name="adj" fmla="val 5677"/>
                       </a:avLst>
                     </a:prstGeom>
                     <a:solidFill>
@@ -99,6 +256,23 @@
                       <w:p>
                         <w:pPr>
                           <w:spacing w:before="0" w:after="0"/>
+                          <w:jc w:val="center"/>
+                        </w:pPr>
+                        <w:r>
+                          <w:rPr>
+                            <w:rFonts w:ascii="Calibri" w:hAnsi="Calibri" w:eastAsia="Calibri" w:cs="Calibri"/>
+                            <w:b/>
+                            <w:i/>
+                            <w:color w:val="C00000"/>
+                            <w:sz w:val="21"/>
+                            <w:u w:val="none"/>
+                          </w:rPr>
+                          <w:t>Important information, please read carefully</w:t>
+                        </w:r>
+                      </w:p>
+                      <w:p>
+                        <w:pPr>
+                          <w:spacing w:before="120" w:after="0"/>
                           <w:jc w:val="both"/>
                         </w:pPr>
                         <w:r>
@@ -110,7 +284,7 @@
                             <w:sz w:val="21"/>
                             <w:u w:val="none"/>
                           </w:rPr>
-                          <w:t xml:space="preserve">AI tools policy for problem sets:  </w:t>
+                          <w:t xml:space="preserve">AI tools policy for problem sets: </w:t>
                         </w:r>
                         <w:r>
                           <w:rPr>
@@ -121,7 +295,7 @@
                             <w:sz w:val="21"/>
                             <w:u w:val="none"/>
                           </w:rPr>
-                          <w:t>For problem sets, you may use AI tools (e.g. ChatGPT) to help brainstorm or to revise existing work you have written. When you submit your problem set, we expect you to clearly attribute what text was generated by the AI tool (e.g., AI-generated text appears in a different colored font, quoted directly in the text, or use an in-text parenthetical citation). While AI tools can provide helpful insights, we want you to think critically about the information you receive. We encourage you to ask specific questions, provide context, and evaluate the quality of the answers provided by AI tools. Remember, the answers are not always correct.</w:t>
+                          <w:t>For problem sets, you may use AI tools (e.g. ChatGPT) to help brainstorm or to revise existing work you have written. When you submit your problem set, we expect you to clearly attribute what text was generated by the AI tool (e.g., AI-generated text appears in a different colored font, quoted directly in the text, or use an in-text parenthetical citation). We will screen for undisclosed AI-generated content using advanced AI-detection programs. While AI tools can provide helpful insights, we want you to think critically about the information you receive. Think of AI tools as a study partner who can help you dive deeper into the concepts behind each problem set exercise. You will have to prove your understanding in the midterm and final exams, where the use of AI tools will be prohibited.</w:t>
                         </w:r>
                       </w:p>
                     </w:txbxContent>
@@ -142,7 +316,7 @@
         <w:tabs>
           <w:tab w:pos="9360" w:val="right"/>
         </w:tabs>
-        <w:spacing w:before="280" w:after="120"/>
+        <w:spacing w:before="280" w:after="80"/>
         <w:pBdr>
           <w:bottom w:val="single" w:sz="6" w:space="2" w:color="C8CDD3"/>
         </w:pBdr>
@@ -182,7 +356,7 @@
     <w:p>
       <w:pPr>
         <w:keepNext/>
-        <w:spacing w:before="0" w:after="160"/>
+        <w:spacing w:before="0" w:after="100"/>
       </w:pPr>
       <w:r>
         <w:rPr>
@@ -206,71 +380,10 @@
           <w:rFonts w:ascii="Calibri" w:hAnsi="Calibri" w:eastAsia="Calibri" w:cs="Calibri"/>
           <w:b w:val="0"/>
           <w:i w:val="0"/>
+          <w:sz w:val="22"/>
           <w:u w:val="none"/>
         </w:rPr>
-        <w:t xml:space="preserve">Your gardener, who has thus far been employed by a large landscaping company (with an annual salary of </w:t>
-      </w:r>
-      <w:del w:id="900" w:author="Claude (proposed)" w:date="2026-09-06T00:00:00Z">
-        <w:r>
-          <w:rPr>
-            <w:rFonts w:ascii="Calibri" w:hAnsi="Calibri" w:eastAsia="Calibri" w:cs="Calibri"/>
-            <w:b w:val="0"/>
-            <w:i w:val="0"/>
-            <w:u w:val="none"/>
-          </w:rPr>
-          <w:delText>$40,000</w:delText>
-        </w:r>
-      </w:del>
-      <w:ins w:id="901" w:author="Claude (proposed)" w:date="2026-09-06T00:00:00Z">
-        <w:r>
-          <w:rPr>
-            <w:rFonts w:ascii="Calibri" w:hAnsi="Calibri" w:eastAsia="Calibri" w:cs="Calibri"/>
-            <w:b w:val="0"/>
-            <w:i w:val="0"/>
-            <w:u w:val="none"/>
-          </w:rPr>
-          <w:t>$46,000</w:t>
-        </w:r>
-      </w:ins>
-      <w:r>
-        <w:rPr>
-          <w:rFonts w:ascii="Calibri" w:hAnsi="Calibri" w:eastAsia="Calibri" w:cs="Calibri"/>
-          <w:b w:val="0"/>
-          <w:i w:val="0"/>
-          <w:u w:val="none"/>
-        </w:rPr>
-        <w:t xml:space="preserve">), approaches you with a question: Should he open his own gardening business? He is located in West L.A. and heard from other gardeners that he can expect annual revenues of </w:t>
-      </w:r>
-      <w:del w:id="902" w:author="Claude (proposed)" w:date="2026-09-06T00:00:00Z">
-        <w:r>
-          <w:rPr>
-            <w:rFonts w:ascii="Calibri" w:hAnsi="Calibri" w:eastAsia="Calibri" w:cs="Calibri"/>
-            <w:b w:val="0"/>
-            <w:i w:val="0"/>
-            <w:u w:val="none"/>
-          </w:rPr>
-          <w:delText>$70,000</w:delText>
-        </w:r>
-      </w:del>
-      <w:ins w:id="903" w:author="Claude (proposed)" w:date="2026-09-06T00:00:00Z">
-        <w:r>
-          <w:rPr>
-            <w:rFonts w:ascii="Calibri" w:hAnsi="Calibri" w:eastAsia="Calibri" w:cs="Calibri"/>
-            <w:b w:val="0"/>
-            <w:i w:val="0"/>
-            <w:u w:val="none"/>
-          </w:rPr>
-          <w:t>$78,000</w:t>
-        </w:r>
-      </w:ins>
-      <w:r>
-        <w:rPr>
-          <w:rFonts w:ascii="Calibri" w:hAnsi="Calibri" w:eastAsia="Calibri" w:cs="Calibri"/>
-          <w:b w:val="0"/>
-          <w:i w:val="0"/>
-          <w:u w:val="none"/>
-        </w:rPr>
-        <w:t>. Try your best to provide a recommendation, by making reasonable, well-informed assumptions about all the relevant cost components. For each cost component, state briefly what brought you to this assumption. You may use references to (online) sources. Distinguish between explicit and implicit costs of the gardening business.</w:t>
+        <w:t>Your gardener, who has thus far been employed by a large landscaping company (with an annual salary of $46,000), approaches you with a question: Should he open his own gardening business? He is located in West L.A. and heard from other gardeners that he can expect annual revenues of $78,000. Try your best to provide a recommendation, by making reasonable, well-informed assumptions about all the relevant cost components. For each cost component, state briefly what brought you to this assumption. You may use references to (online) sources. Distinguish between explicit and implicit costs of the gardening business.</w:t>
       </w:r>
     </w:p>
     <w:p>
@@ -283,71 +396,10 @@
           <w:rFonts w:ascii="Calibri" w:hAnsi="Calibri" w:eastAsia="Calibri" w:cs="Calibri"/>
           <w:b w:val="0"/>
           <w:i w:val="0"/>
+          <w:sz w:val="22"/>
           <w:u w:val="none"/>
         </w:rPr>
-        <w:t xml:space="preserve">[Note: There is no “right” or “wrong” answer. We want to evaluate your reasoning based on the economic concepts learned in class. For simplicity, use average annual costs for all components – for example, if a new truck costs </w:t>
-      </w:r>
-      <w:del w:id="904" w:author="Claude (proposed)" w:date="2026-09-06T00:00:00Z">
-        <w:r>
-          <w:rPr>
-            <w:rFonts w:ascii="Calibri" w:hAnsi="Calibri" w:eastAsia="Calibri" w:cs="Calibri"/>
-            <w:b w:val="0"/>
-            <w:i w:val="0"/>
-            <w:u w:val="none"/>
-          </w:rPr>
-          <w:delText>$30,000</w:delText>
-        </w:r>
-      </w:del>
-      <w:ins w:id="905" w:author="Claude (proposed)" w:date="2026-09-06T00:00:00Z">
-        <w:r>
-          <w:rPr>
-            <w:rFonts w:ascii="Calibri" w:hAnsi="Calibri" w:eastAsia="Calibri" w:cs="Calibri"/>
-            <w:b w:val="0"/>
-            <w:i w:val="0"/>
-            <w:u w:val="none"/>
-          </w:rPr>
-          <w:t>$40,000</w:t>
-        </w:r>
-      </w:ins>
-      <w:r>
-        <w:rPr>
-          <w:rFonts w:ascii="Calibri" w:hAnsi="Calibri" w:eastAsia="Calibri" w:cs="Calibri"/>
-          <w:b w:val="0"/>
-          <w:i w:val="0"/>
-          <w:u w:val="none"/>
-        </w:rPr>
-        <w:t xml:space="preserve"> and can be used for 10 years, the average annual cost would be </w:t>
-      </w:r>
-      <w:del w:id="906" w:author="Claude (proposed)" w:date="2026-09-06T00:00:00Z">
-        <w:r>
-          <w:rPr>
-            <w:rFonts w:ascii="Calibri" w:hAnsi="Calibri" w:eastAsia="Calibri" w:cs="Calibri"/>
-            <w:b w:val="0"/>
-            <w:i w:val="0"/>
-            <w:u w:val="none"/>
-          </w:rPr>
-          <w:delText>$3,000</w:delText>
-        </w:r>
-      </w:del>
-      <w:ins w:id="907" w:author="Claude (proposed)" w:date="2026-09-06T00:00:00Z">
-        <w:r>
-          <w:rPr>
-            <w:rFonts w:ascii="Calibri" w:hAnsi="Calibri" w:eastAsia="Calibri" w:cs="Calibri"/>
-            <w:b w:val="0"/>
-            <w:i w:val="0"/>
-            <w:u w:val="none"/>
-          </w:rPr>
-          <w:t>$4,000</w:t>
-        </w:r>
-      </w:ins>
-      <w:r>
-        <w:rPr>
-          <w:rFonts w:ascii="Calibri" w:hAnsi="Calibri" w:eastAsia="Calibri" w:cs="Calibri"/>
-          <w:b w:val="0"/>
-          <w:i w:val="0"/>
-          <w:u w:val="none"/>
-        </w:rPr>
-        <w:t>.]</w:t>
+        <w:t>[Note: There is no “right” or “wrong” answer. We want to evaluate your reasoning based on the economic concepts learned in class, not on the precision of your numerical assumptions. For simplicity, use average annual costs for all components – for example, if a new truck costs $40,000 and can be used for 10 years, the average annual cost would be $4,000. Your answer does not need to exceed 1 page.]</w:t>
       </w:r>
     </w:p>
     <w:p>
@@ -356,7 +408,7 @@
         <w:tabs>
           <w:tab w:pos="9360" w:val="right"/>
         </w:tabs>
-        <w:spacing w:before="340" w:after="120"/>
+        <w:spacing w:before="240" w:after="80"/>
         <w:pBdr>
           <w:bottom w:val="single" w:sz="6" w:space="2" w:color="C8CDD3"/>
         </w:pBdr>
@@ -396,7 +448,7 @@
     <w:p>
       <w:pPr>
         <w:keepNext/>
-        <w:spacing w:before="0" w:after="160"/>
+        <w:spacing w:before="0" w:after="100"/>
       </w:pPr>
       <w:r>
         <w:rPr>
@@ -591,7 +643,7 @@
     </w:p>
     <w:p>
       <w:pPr>
-        <w:spacing w:before="160" w:after="80"/>
+        <w:spacing w:before="120" w:after="60"/>
         <w:ind w:left="432" w:hanging="432"/>
         <w:jc w:val="both"/>
       </w:pPr>
@@ -647,7 +699,7 @@
     </w:p>
     <w:p>
       <w:pPr>
-        <w:spacing w:before="160" w:after="80"/>
+        <w:spacing w:before="120" w:after="60"/>
         <w:ind w:left="432" w:hanging="432"/>
         <w:jc w:val="both"/>
       </w:pPr>
@@ -703,7 +755,7 @@
     </w:p>
     <w:p>
       <w:pPr>
-        <w:spacing w:before="160" w:after="80"/>
+        <w:spacing w:before="120" w:after="60"/>
         <w:ind w:left="432" w:hanging="432"/>
         <w:jc w:val="both"/>
       </w:pPr>
@@ -745,7 +797,7 @@
         <w:tabs>
           <w:tab w:pos="9360" w:val="right"/>
         </w:tabs>
-        <w:spacing w:before="340" w:after="120"/>
+        <w:spacing w:before="240" w:after="80"/>
         <w:pBdr>
           <w:bottom w:val="single" w:sz="6" w:space="2" w:color="C8CDD3"/>
         </w:pBdr>
@@ -785,7 +837,7 @@
     <w:p>
       <w:pPr>
         <w:keepNext/>
-        <w:spacing w:before="0" w:after="160"/>
+        <w:spacing w:before="0" w:after="100"/>
       </w:pPr>
       <w:r>
         <w:rPr>
@@ -812,12 +864,12 @@
           <w:sz w:val="22"/>
           <w:u w:val="none"/>
         </w:rPr>
-        <w:t>During major economic crises (such as the “Great Recession” in 2008), many households started experiencing a sharp increase in economic uncertainty and/or see their assets losing value due to stock market devaluation. This can lead to a decrease in household expected and realized income.</w:t>
+        <w:t>During major economic crises (such as the “Great Recession” in 2008), many households started experiencing a sharp increase in economic uncertainty and/or saw their assets losing value due to stock market devaluation. This can lead to a decrease in household expected and realized income.</w:t>
       </w:r>
     </w:p>
     <w:p>
       <w:pPr>
-        <w:spacing w:before="160" w:after="80"/>
+        <w:spacing w:before="120" w:after="60"/>
         <w:ind w:left="432" w:hanging="432"/>
         <w:jc w:val="both"/>
       </w:pPr>
@@ -850,43 +902,12 @@
           <w:i w:val="0"/>
           <w:u w:val="none"/>
         </w:rPr>
-        <w:t xml:space="preserve">Choose three products or services and rank them according to how much you expect quantity demanded to fall after the onset of a crisis, from largest to smallest decline. Justify your ranking based on the concept of income elasticity of demand. Here you are encouraged to give examples from your own experience during times of economic crises or uncertainty, or from the sector you’re working in. For simplicity, you can assume that the supply curve remains unchanged. Tie your argument to </w:t>
-      </w:r>
-      <w:del w:id="908" w:author="Claude (proposed)" w:date="2026-09-06T00:00:00Z">
-        <w:r>
-          <w:rPr>
-            <w:rFonts w:ascii="Calibri" w:hAnsi="Calibri" w:eastAsia="Calibri" w:cs="Calibri"/>
-            <w:b w:val="0"/>
-            <w:i w:val="0"/>
-            <w:u w:val="none"/>
-          </w:rPr>
-          <w:delText>movements of</w:delText>
-        </w:r>
-      </w:del>
-      <w:ins w:id="909" w:author="Claude (proposed)" w:date="2026-09-06T00:00:00Z">
-        <w:r>
-          <w:rPr>
-            <w:rFonts w:ascii="Calibri" w:hAnsi="Calibri" w:eastAsia="Calibri" w:cs="Calibri"/>
-            <w:b w:val="0"/>
-            <w:i w:val="0"/>
-            <w:u w:val="none"/>
-          </w:rPr>
-          <w:t>shifts of</w:t>
-        </w:r>
-      </w:ins>
-      <w:r>
-        <w:rPr>
-          <w:rFonts w:ascii="Calibri" w:hAnsi="Calibri" w:eastAsia="Calibri" w:cs="Calibri"/>
-          <w:b w:val="0"/>
-          <w:i w:val="0"/>
-          <w:u w:val="none"/>
-        </w:rPr>
-        <w:t xml:space="preserve"> the demand curve.</w:t>
+        <w:t>Choose three products or services and rank them according to how much you expect quantity demanded to fall after the onset of a crisis, from largest to smallest decline. Justify your ranking based on the concept of income elasticity of demand. Here you are encouraged to give examples from your own experience during times of economic crises or uncertainty, or from the sector you’re working in. For simplicity, you can assume that the supply curve remains unchanged. Tie your argument to shifts of the demand curve.</w:t>
       </w:r>
     </w:p>
     <w:p>
       <w:pPr>
-        <w:spacing w:before="160" w:after="80"/>
+        <w:spacing w:before="120" w:after="60"/>
         <w:ind w:left="432" w:hanging="432"/>
         <w:jc w:val="both"/>
       </w:pPr>
@@ -919,12 +940,12 @@
           <w:i w:val="0"/>
           <w:u w:val="none"/>
         </w:rPr>
-        <w:t>Provide a visual representation of the changes in the three industries that you wrote about in point (a). What happens to quantities and prices in equilibrium (holding supply constant)? You may use AI tools to produce graphs.</w:t>
+        <w:t>Provide a visual representation of the changes in the three industries that you wrote about in point (a). What happens to quantities and prices in equilibrium (assuming the supply curve does not shift)? You may use AI tools to produce graphs. [Note: Although not required for full credit, here it will be useful for you to think about the slope of the supply curve (e.g. can this industry produce more units easily? Will the cost of the extra units be significantly higher?).]</w:t>
       </w:r>
     </w:p>
     <w:p>
       <w:pPr>
-        <w:spacing w:before="160" w:after="80"/>
+        <w:spacing w:before="120" w:after="60"/>
         <w:ind w:left="432" w:hanging="432"/>
         <w:jc w:val="both"/>
       </w:pPr>
@@ -962,7 +983,7 @@
     </w:p>
     <w:p>
       <w:pPr>
-        <w:spacing w:before="160" w:after="80"/>
+        <w:spacing w:before="120" w:after="60"/>
         <w:ind w:left="432" w:hanging="432"/>
         <w:jc w:val="both"/>
       </w:pPr>
@@ -1004,7 +1025,7 @@
         <w:tabs>
           <w:tab w:pos="9360" w:val="right"/>
         </w:tabs>
-        <w:spacing w:before="340" w:after="120"/>
+        <w:spacing w:before="240" w:after="80"/>
         <w:pBdr>
           <w:bottom w:val="single" w:sz="6" w:space="2" w:color="C8CDD3"/>
         </w:pBdr>
@@ -1044,7 +1065,7 @@
     <w:p>
       <w:pPr>
         <w:keepNext/>
-        <w:spacing w:before="0" w:after="160"/>
+        <w:spacing w:before="0" w:after="100"/>
       </w:pPr>
       <w:r>
         <w:rPr>
@@ -1068,32 +1089,40 @@
           <w:rFonts w:ascii="Calibri" w:hAnsi="Calibri" w:eastAsia="Calibri" w:cs="Calibri"/>
           <w:b w:val="0"/>
           <w:i w:val="0"/>
+          <w:sz w:val="22"/>
           <w:u w:val="none"/>
         </w:rPr>
-        <w:t xml:space="preserve">You are hired as a consultant by a large fast food chain. The company would like to understand whether an expansion of unemployment benefits in California could affect </w:t>
+        <w:t>You are hired as a consultant by a large fast food chain. The company would like to understand whether an expansion of unemployment benefits in California could affect its capacity to hire low-skilled workers in the state. Use a supply-demand framework for labor to analyze this question.</w:t>
       </w:r>
-      <w:del w:id="910" w:author="Claude (proposed)" w:date="2026-09-06T00:00:00Z">
-        <w:r>
-          <w:rPr>
-            <w:rFonts w:ascii="Calibri" w:hAnsi="Calibri" w:eastAsia="Calibri" w:cs="Calibri"/>
-            <w:b w:val="0"/>
-            <w:i w:val="0"/>
-            <w:u w:val="none"/>
-          </w:rPr>
-          <w:delText>their</w:delText>
-        </w:r>
-      </w:del>
-      <w:ins w:id="911" w:author="Claude (proposed)" w:date="2026-09-06T00:00:00Z">
-        <w:r>
-          <w:rPr>
-            <w:rFonts w:ascii="Calibri" w:hAnsi="Calibri" w:eastAsia="Calibri" w:cs="Calibri"/>
-            <w:b w:val="0"/>
-            <w:i w:val="0"/>
-            <w:u w:val="none"/>
-          </w:rPr>
-          <w:t>its</w:t>
-        </w:r>
-      </w:ins>
+    </w:p>
+    <w:p>
+      <w:pPr>
+        <w:spacing w:before="120" w:after="60"/>
+        <w:ind w:left="432" w:hanging="432"/>
+        <w:jc w:val="both"/>
+      </w:pPr>
+      <w:r>
+        <w:rPr>
+          <w:rFonts w:ascii="Calibri" w:hAnsi="Calibri" w:eastAsia="Calibri" w:cs="Calibri"/>
+          <w:b/>
+          <w:i w:val="0"/>
+          <w:color w:val="0B2B4E"/>
+          <w:sz w:val="22"/>
+          <w:u w:val="none"/>
+        </w:rPr>
+        <w:t xml:space="preserve">(a)  </w:t>
+      </w:r>
+      <w:r>
+        <w:rPr>
+          <w:rFonts w:ascii="Calibri" w:hAnsi="Calibri" w:eastAsia="Calibri" w:cs="Calibri"/>
+          <w:b/>
+          <w:i w:val="0"/>
+          <w:color w:val="E09F3E"/>
+          <w:sz w:val="21"/>
+          <w:u w:val="none"/>
+        </w:rPr>
+        <w:t xml:space="preserve">(8 points)  </w:t>
+      </w:r>
       <w:r>
         <w:rPr>
           <w:rFonts w:ascii="Calibri" w:hAnsi="Calibri" w:eastAsia="Calibri" w:cs="Calibri"/>
@@ -1101,204 +1130,120 @@
           <w:i w:val="0"/>
           <w:u w:val="none"/>
         </w:rPr>
-        <w:t xml:space="preserve"> capacity to hire low-skilled workers in the state. Use a supply-demand framework for labor to analyze this question.</w:t>
+        <w:t>Draw and label a graph that depicts a demand curve and a supply curve in the market for low-skilled labor, and identify the equilibrium (low-skill) wage rate in the graph. Hint: Put low-skill labor on the x-axis and wages on the y-axis. Low-skill labor demand represents the amount of low-skill labor demanded by all firms in California; labor supply is the total quantity of low-skill labor supplied by all workers in the state.</w:t>
       </w:r>
     </w:p>
     <w:p>
       <w:pPr>
-        <w:spacing w:before="160" w:after="80"/>
+        <w:spacing w:before="120" w:after="60"/>
         <w:ind w:left="432" w:hanging="432"/>
         <w:jc w:val="both"/>
+      </w:pPr>
+      <w:r>
         <w:rPr>
-          <w:ins w:id="912" w:author="Claude (proposed)" w:date="2026-09-06T00:00:00Z"/>
+          <w:rFonts w:ascii="Calibri" w:hAnsi="Calibri" w:eastAsia="Calibri" w:cs="Calibri"/>
+          <w:b/>
+          <w:i w:val="0"/>
+          <w:color w:val="0B2B4E"/>
+          <w:sz w:val="22"/>
+          <w:u w:val="none"/>
         </w:rPr>
-      </w:pPr>
-      <w:ins w:id="913" w:author="Claude (proposed)" w:date="2026-09-06T00:00:00Z">
-        <w:r>
-          <w:rPr>
-            <w:rFonts w:ascii="Calibri" w:hAnsi="Calibri" w:eastAsia="Calibri" w:cs="Calibri"/>
-            <w:b/>
-            <w:i w:val="0"/>
-            <w:color w:val="0B2B4E"/>
-            <w:sz w:val="22"/>
-            <w:u w:val="none"/>
-          </w:rPr>
-          <w:t xml:space="preserve">(a)  </w:t>
-        </w:r>
-        <w:r>
-          <w:rPr>
-            <w:rFonts w:ascii="Calibri" w:hAnsi="Calibri" w:eastAsia="Calibri" w:cs="Calibri"/>
-            <w:b/>
-            <w:i w:val="0"/>
-            <w:color w:val="E09F3E"/>
-            <w:sz w:val="21"/>
-            <w:u w:val="none"/>
-          </w:rPr>
-          <w:t xml:space="preserve">(8 points)  </w:t>
-        </w:r>
-      </w:ins>
-      <w:ins w:id="914" w:author="Claude (proposed)" w:date="2026-09-06T00:00:00Z">
-        <w:r>
-          <w:rPr>
-            <w:rFonts w:ascii="Calibri" w:hAnsi="Calibri" w:eastAsia="Calibri" w:cs="Calibri"/>
-            <w:b w:val="0"/>
-            <w:i w:val="0"/>
-            <w:u w:val="none"/>
-          </w:rPr>
-          <w:t>Draw and label a graph that depicts a demand curve and a supply curve in the market for low-skilled labor, and identify the equilibrium (low-skill) wage rate in the graph. Hint: Put low-skill labor on the x-axis and wages on the y-axis. Low-skill labor demand represents the amount of low-skill labor demanded by all firms in California; labor supply is the total quantity of low-skill labor supplied by all workers in the state.</w:t>
-        </w:r>
-      </w:ins>
+        <w:t xml:space="preserve">(b)  </w:t>
+      </w:r>
+      <w:r>
+        <w:rPr>
+          <w:rFonts w:ascii="Calibri" w:hAnsi="Calibri" w:eastAsia="Calibri" w:cs="Calibri"/>
+          <w:b/>
+          <w:i w:val="0"/>
+          <w:color w:val="E09F3E"/>
+          <w:sz w:val="21"/>
+          <w:u w:val="none"/>
+        </w:rPr>
+        <w:t xml:space="preserve">(12 points)  </w:t>
+      </w:r>
+      <w:r>
+        <w:rPr>
+          <w:rFonts w:ascii="Calibri" w:hAnsi="Calibri" w:eastAsia="Calibri" w:cs="Calibri"/>
+          <w:b w:val="0"/>
+          <w:i w:val="0"/>
+          <w:u w:val="none"/>
+        </w:rPr>
+        <w:t xml:space="preserve">Does an expansion of unemployment benefits shift the labor </w:t>
+      </w:r>
+      <w:r>
+        <w:rPr>
+          <w:rFonts w:ascii="Calibri" w:hAnsi="Calibri" w:eastAsia="Calibri" w:cs="Calibri"/>
+          <w:b/>
+          <w:i w:val="0"/>
+          <w:u w:val="none"/>
+        </w:rPr>
+        <w:t>supply</w:t>
+      </w:r>
+      <w:r>
+        <w:rPr>
+          <w:rFonts w:ascii="Calibri" w:hAnsi="Calibri" w:eastAsia="Calibri" w:cs="Calibri"/>
+          <w:b w:val="0"/>
+          <w:i w:val="0"/>
+          <w:u w:val="none"/>
+        </w:rPr>
+        <w:t xml:space="preserve"> curve? Explain why or why not, and show the shift in your graph.</w:t>
+      </w:r>
     </w:p>
     <w:p>
       <w:pPr>
-        <w:spacing w:before="160" w:after="80"/>
+        <w:spacing w:before="120" w:after="60"/>
         <w:ind w:left="432" w:hanging="432"/>
         <w:jc w:val="both"/>
+      </w:pPr>
+      <w:r>
         <w:rPr>
-          <w:ins w:id="915" w:author="Claude (proposed)" w:date="2026-09-06T00:00:00Z"/>
+          <w:rFonts w:ascii="Calibri" w:hAnsi="Calibri" w:eastAsia="Calibri" w:cs="Calibri"/>
+          <w:b/>
+          <w:i w:val="0"/>
+          <w:color w:val="0B2B4E"/>
+          <w:sz w:val="22"/>
+          <w:u w:val="none"/>
         </w:rPr>
-      </w:pPr>
-      <w:ins w:id="916" w:author="Claude (proposed)" w:date="2026-09-06T00:00:00Z">
-        <w:r>
-          <w:rPr>
-            <w:rFonts w:ascii="Calibri" w:hAnsi="Calibri" w:eastAsia="Calibri" w:cs="Calibri"/>
-            <w:b/>
-            <w:i w:val="0"/>
-            <w:color w:val="0B2B4E"/>
-            <w:sz w:val="22"/>
-            <w:u w:val="none"/>
-          </w:rPr>
-          <w:t xml:space="preserve">(b)  </w:t>
-        </w:r>
-        <w:r>
-          <w:rPr>
-            <w:rFonts w:ascii="Calibri" w:hAnsi="Calibri" w:eastAsia="Calibri" w:cs="Calibri"/>
-            <w:b/>
-            <w:i w:val="0"/>
-            <w:color w:val="E09F3E"/>
-            <w:sz w:val="21"/>
-            <w:u w:val="none"/>
-          </w:rPr>
-          <w:t xml:space="preserve">(12 points)  </w:t>
-        </w:r>
-      </w:ins>
-      <w:ins w:id="917" w:author="Claude (proposed)" w:date="2026-09-06T00:00:00Z">
-        <w:r>
-          <w:rPr>
-            <w:rFonts w:ascii="Calibri" w:hAnsi="Calibri" w:eastAsia="Calibri" w:cs="Calibri"/>
-            <w:b w:val="0"/>
-            <w:i w:val="0"/>
-            <w:u w:val="none"/>
-          </w:rPr>
-          <w:t xml:space="preserve">Does an expansion of unemployment benefits shift the labor </w:t>
-        </w:r>
-      </w:ins>
-      <w:ins w:id="918" w:author="Claude (proposed)" w:date="2026-09-06T00:00:00Z">
-        <w:r>
-          <w:rPr>
-            <w:rFonts w:ascii="Calibri" w:hAnsi="Calibri" w:eastAsia="Calibri" w:cs="Calibri"/>
-            <w:b/>
-            <w:i w:val="0"/>
-            <w:u w:val="none"/>
-          </w:rPr>
-          <w:t>supply</w:t>
-        </w:r>
-      </w:ins>
-      <w:ins w:id="919" w:author="Claude (proposed)" w:date="2026-09-06T00:00:00Z">
-        <w:r>
-          <w:rPr>
-            <w:rFonts w:ascii="Calibri" w:hAnsi="Calibri" w:eastAsia="Calibri" w:cs="Calibri"/>
-            <w:b w:val="0"/>
-            <w:i w:val="0"/>
-            <w:u w:val="none"/>
-          </w:rPr>
-          <w:t xml:space="preserve"> curve? Explain why or why not, and show the shift in your graph.</w:t>
-        </w:r>
-      </w:ins>
-    </w:p>
-    <w:p>
-      <w:pPr>
-        <w:spacing w:before="160" w:after="80"/>
-        <w:ind w:left="432" w:hanging="432"/>
-        <w:jc w:val="both"/>
+        <w:t xml:space="preserve">(c)  </w:t>
+      </w:r>
+      <w:r>
         <w:rPr>
-          <w:ins w:id="920" w:author="Claude (proposed)" w:date="2026-09-06T00:00:00Z"/>
+          <w:rFonts w:ascii="Calibri" w:hAnsi="Calibri" w:eastAsia="Calibri" w:cs="Calibri"/>
+          <w:b/>
+          <w:i w:val="0"/>
+          <w:color w:val="E09F3E"/>
+          <w:sz w:val="21"/>
+          <w:u w:val="none"/>
         </w:rPr>
-      </w:pPr>
-      <w:ins w:id="921" w:author="Claude (proposed)" w:date="2026-09-06T00:00:00Z">
-        <w:r>
-          <w:rPr>
-            <w:rFonts w:ascii="Calibri" w:hAnsi="Calibri" w:eastAsia="Calibri" w:cs="Calibri"/>
-            <w:b/>
-            <w:i w:val="0"/>
-            <w:color w:val="0B2B4E"/>
-            <w:sz w:val="22"/>
-            <w:u w:val="none"/>
-          </w:rPr>
-          <w:t xml:space="preserve">(c)  </w:t>
-        </w:r>
-        <w:r>
-          <w:rPr>
-            <w:rFonts w:ascii="Calibri" w:hAnsi="Calibri" w:eastAsia="Calibri" w:cs="Calibri"/>
-            <w:b/>
-            <w:i w:val="0"/>
-            <w:color w:val="E09F3E"/>
-            <w:sz w:val="21"/>
-            <w:u w:val="none"/>
-          </w:rPr>
-          <w:t xml:space="preserve">(5 points)  </w:t>
-        </w:r>
-      </w:ins>
-      <w:ins w:id="922" w:author="Claude (proposed)" w:date="2026-09-06T00:00:00Z">
-        <w:r>
-          <w:rPr>
-            <w:rFonts w:ascii="Calibri" w:hAnsi="Calibri" w:eastAsia="Calibri" w:cs="Calibri"/>
-            <w:b w:val="0"/>
-            <w:i w:val="0"/>
-            <w:u w:val="none"/>
-          </w:rPr>
-          <w:t xml:space="preserve">Does it shift the labor </w:t>
-        </w:r>
-      </w:ins>
-      <w:ins w:id="923" w:author="Claude (proposed)" w:date="2026-09-06T00:00:00Z">
-        <w:r>
-          <w:rPr>
-            <w:rFonts w:ascii="Calibri" w:hAnsi="Calibri" w:eastAsia="Calibri" w:cs="Calibri"/>
-            <w:b/>
-            <w:i w:val="0"/>
-            <w:u w:val="none"/>
-          </w:rPr>
-          <w:t>demand</w:t>
-        </w:r>
-      </w:ins>
-      <w:ins w:id="924" w:author="Claude (proposed)" w:date="2026-09-06T00:00:00Z">
-        <w:r>
-          <w:rPr>
-            <w:rFonts w:ascii="Calibri" w:hAnsi="Calibri" w:eastAsia="Calibri" w:cs="Calibri"/>
-            <w:b w:val="0"/>
-            <w:i w:val="0"/>
-            <w:u w:val="none"/>
-          </w:rPr>
-          <w:t xml:space="preserve"> curve? Explain why or why not.</w:t>
-        </w:r>
-      </w:ins>
-    </w:p>
-    <w:p>
-      <w:pPr>
-        <w:spacing w:before="0" w:after="180"/>
-        <w:jc w:val="both"/>
-      </w:pPr>
-      <w:del w:id="925" w:author="Claude (proposed)" w:date="2026-09-06T00:00:00Z">
-        <w:r>
-          <w:rPr>
-            <w:rFonts w:ascii="Calibri" w:hAnsi="Calibri" w:eastAsia="Calibri" w:cs="Calibri"/>
-            <w:b w:val="0"/>
-            <w:i w:val="0"/>
-            <w:u w:val="none"/>
-          </w:rPr>
-          <w:delText>As a starting point, draw and label a graph that depicts a demand curve and a supply curve in the market for low-skilled labor. Identify the equilibrium (low-skill) wage rate in the graph. Hint: Put low-skill labor on the x-axis and wages on the y-axis. Low-skill labor demand represents the amount of low-skill labor demanded by all firms in California; labor supply is the total quantity of low-skill labor supplied by all workers in the state. Distinguish between shifts in the labor supply and labor demand curves and discuss why each of the two shifts (or does not).</w:delText>
-        </w:r>
-      </w:del>
+        <w:t xml:space="preserve">(5 points)  </w:t>
+      </w:r>
+      <w:r>
+        <w:rPr>
+          <w:rFonts w:ascii="Calibri" w:hAnsi="Calibri" w:eastAsia="Calibri" w:cs="Calibri"/>
+          <w:b w:val="0"/>
+          <w:i w:val="0"/>
+          <w:u w:val="none"/>
+        </w:rPr>
+        <w:t xml:space="preserve">Does it shift the labor </w:t>
+      </w:r>
+      <w:r>
+        <w:rPr>
+          <w:rFonts w:ascii="Calibri" w:hAnsi="Calibri" w:eastAsia="Calibri" w:cs="Calibri"/>
+          <w:b/>
+          <w:i w:val="0"/>
+          <w:u w:val="none"/>
+        </w:rPr>
+        <w:t>demand</w:t>
+      </w:r>
+      <w:r>
+        <w:rPr>
+          <w:rFonts w:ascii="Calibri" w:hAnsi="Calibri" w:eastAsia="Calibri" w:cs="Calibri"/>
+          <w:b w:val="0"/>
+          <w:i w:val="0"/>
+          <w:u w:val="none"/>
+        </w:rPr>
+        <w:t xml:space="preserve"> curve? Explain why or why not.</w:t>
+      </w:r>
     </w:p>
     <w:sectPr>
       <w:footerReference w:type="default" r:id="rId9"/>

</xml_diff>